<commit_message>
Finished first API version
</commit_message>
<xml_diff>
--- a/docs/REST API.docx
+++ b/docs/REST API.docx
@@ -1717,6 +1717,523 @@
           <w:sz w:val="22"/>
           <w:szCs w:val="22"/>
         </w:rPr>
+        <w:t>W przypadku przebudowania po raz kolejny, usunąć stary</w:t>
+      </w:r>
+      <w:r>
+        <w:rPr>
+          <w:rFonts w:ascii="Arial" w:hAnsi="Arial" w:cs="Arial"/>
+          <w:color w:val="000000" w:themeColor="text1"/>
+          <w:sz w:val="22"/>
+          <w:szCs w:val="22"/>
+        </w:rPr>
+        <w:t xml:space="preserve"> kontener</w:t>
+      </w:r>
+      <w:r>
+        <w:rPr>
+          <w:rFonts w:ascii="Arial" w:hAnsi="Arial" w:cs="Arial"/>
+          <w:color w:val="000000" w:themeColor="text1"/>
+          <w:sz w:val="22"/>
+          <w:szCs w:val="22"/>
+        </w:rPr>
+        <w:t>:</w:t>
+      </w:r>
+      <w:r>
+        <w:rPr>
+          <w:rFonts w:ascii="Arial" w:hAnsi="Arial" w:cs="Arial"/>
+          <w:color w:val="000000" w:themeColor="text1"/>
+          <w:sz w:val="22"/>
+          <w:szCs w:val="22"/>
+        </w:rPr>
+        <w:br/>
+      </w:r>
+      <w:proofErr w:type="spellStart"/>
+      <w:r>
+        <w:rPr>
+          <w:rFonts w:ascii="Arial" w:hAnsi="Arial" w:cs="Arial"/>
+          <w:color w:val="000000" w:themeColor="text1"/>
+          <w:sz w:val="22"/>
+          <w:szCs w:val="22"/>
+        </w:rPr>
+        <w:t>docker</w:t>
+      </w:r>
+      <w:proofErr w:type="spellEnd"/>
+      <w:r>
+        <w:rPr>
+          <w:rFonts w:ascii="Arial" w:hAnsi="Arial" w:cs="Arial"/>
+          <w:color w:val="000000" w:themeColor="text1"/>
+          <w:sz w:val="22"/>
+          <w:szCs w:val="22"/>
+        </w:rPr>
+        <w:t xml:space="preserve"> </w:t>
+      </w:r>
+      <w:proofErr w:type="spellStart"/>
+      <w:r>
+        <w:rPr>
+          <w:rFonts w:ascii="Arial" w:hAnsi="Arial" w:cs="Arial"/>
+          <w:color w:val="000000" w:themeColor="text1"/>
+          <w:sz w:val="22"/>
+          <w:szCs w:val="22"/>
+        </w:rPr>
+        <w:t>ps</w:t>
+      </w:r>
+      <w:proofErr w:type="spellEnd"/>
+      <w:r>
+        <w:rPr>
+          <w:rFonts w:ascii="Arial" w:hAnsi="Arial" w:cs="Arial"/>
+          <w:color w:val="000000" w:themeColor="text1"/>
+          <w:sz w:val="22"/>
+          <w:szCs w:val="22"/>
+        </w:rPr>
+        <w:t xml:space="preserve"> -a</w:t>
+      </w:r>
+    </w:p>
+    <w:p>
+      <w:pPr>
+        <w:rPr>
+          <w:rFonts w:ascii="Arial" w:hAnsi="Arial" w:cs="Arial"/>
+          <w:color w:val="000000" w:themeColor="text1"/>
+          <w:sz w:val="22"/>
+          <w:szCs w:val="22"/>
+        </w:rPr>
+      </w:pPr>
+      <w:r>
+        <w:rPr>
+          <w:rFonts w:ascii="Arial" w:hAnsi="Arial" w:cs="Arial"/>
+          <w:color w:val="000000" w:themeColor="text1"/>
+          <w:sz w:val="22"/>
+          <w:szCs w:val="22"/>
+        </w:rPr>
+        <w:t>CONTAINER ID   IMAGE                        COMMAND                  CREATED          STATUS                       PORTS     NAMES</w:t>
+      </w:r>
+    </w:p>
+    <w:p>
+      <w:pPr>
+        <w:rPr>
+          <w:rFonts w:ascii="Arial" w:hAnsi="Arial" w:cs="Arial"/>
+          <w:color w:val="000000" w:themeColor="text1"/>
+          <w:sz w:val="22"/>
+          <w:szCs w:val="22"/>
+        </w:rPr>
+      </w:pPr>
+      <w:r>
+        <w:rPr>
+          <w:rFonts w:ascii="Arial" w:hAnsi="Arial" w:cs="Arial"/>
+          <w:color w:val="000000" w:themeColor="text1"/>
+          <w:sz w:val="22"/>
+          <w:szCs w:val="22"/>
+        </w:rPr>
+        <w:t xml:space="preserve">2a4bcdd67ab4   </w:t>
+      </w:r>
+      <w:proofErr w:type="spellStart"/>
+      <w:r>
+        <w:rPr>
+          <w:rFonts w:ascii="Arial" w:hAnsi="Arial" w:cs="Arial"/>
+          <w:color w:val="000000" w:themeColor="text1"/>
+          <w:sz w:val="22"/>
+          <w:szCs w:val="22"/>
+        </w:rPr>
+        <w:t>warfare-simulation-api-app</w:t>
+      </w:r>
+      <w:proofErr w:type="spellEnd"/>
+      <w:r>
+        <w:rPr>
+          <w:rFonts w:ascii="Arial" w:hAnsi="Arial" w:cs="Arial"/>
+          <w:color w:val="000000" w:themeColor="text1"/>
+          <w:sz w:val="22"/>
+          <w:szCs w:val="22"/>
+        </w:rPr>
+        <w:t xml:space="preserve">   "</w:t>
+      </w:r>
+      <w:proofErr w:type="spellStart"/>
+      <w:r>
+        <w:rPr>
+          <w:rFonts w:ascii="Arial" w:hAnsi="Arial" w:cs="Arial"/>
+          <w:color w:val="000000" w:themeColor="text1"/>
+          <w:sz w:val="22"/>
+          <w:szCs w:val="22"/>
+        </w:rPr>
+        <w:t>java</w:t>
+      </w:r>
+      <w:proofErr w:type="spellEnd"/>
+      <w:r>
+        <w:rPr>
+          <w:rFonts w:ascii="Arial" w:hAnsi="Arial" w:cs="Arial"/>
+          <w:color w:val="000000" w:themeColor="text1"/>
+          <w:sz w:val="22"/>
+          <w:szCs w:val="22"/>
+        </w:rPr>
+        <w:t xml:space="preserve"> -jar app.jar"      12 </w:t>
+      </w:r>
+      <w:proofErr w:type="spellStart"/>
+      <w:r>
+        <w:rPr>
+          <w:rFonts w:ascii="Arial" w:hAnsi="Arial" w:cs="Arial"/>
+          <w:color w:val="000000" w:themeColor="text1"/>
+          <w:sz w:val="22"/>
+          <w:szCs w:val="22"/>
+        </w:rPr>
+        <w:t>minutes</w:t>
+      </w:r>
+      <w:proofErr w:type="spellEnd"/>
+      <w:r>
+        <w:rPr>
+          <w:rFonts w:ascii="Arial" w:hAnsi="Arial" w:cs="Arial"/>
+          <w:color w:val="000000" w:themeColor="text1"/>
+          <w:sz w:val="22"/>
+          <w:szCs w:val="22"/>
+        </w:rPr>
+        <w:t xml:space="preserve"> ago   </w:t>
+      </w:r>
+      <w:proofErr w:type="spellStart"/>
+      <w:r>
+        <w:rPr>
+          <w:rFonts w:ascii="Arial" w:hAnsi="Arial" w:cs="Arial"/>
+          <w:color w:val="000000" w:themeColor="text1"/>
+          <w:sz w:val="22"/>
+          <w:szCs w:val="22"/>
+        </w:rPr>
+        <w:t>Exited</w:t>
+      </w:r>
+      <w:proofErr w:type="spellEnd"/>
+      <w:r>
+        <w:rPr>
+          <w:rFonts w:ascii="Arial" w:hAnsi="Arial" w:cs="Arial"/>
+          <w:color w:val="000000" w:themeColor="text1"/>
+          <w:sz w:val="22"/>
+          <w:szCs w:val="22"/>
+        </w:rPr>
+        <w:t xml:space="preserve"> (1) 7 </w:t>
+      </w:r>
+      <w:proofErr w:type="spellStart"/>
+      <w:r>
+        <w:rPr>
+          <w:rFonts w:ascii="Arial" w:hAnsi="Arial" w:cs="Arial"/>
+          <w:color w:val="000000" w:themeColor="text1"/>
+          <w:sz w:val="22"/>
+          <w:szCs w:val="22"/>
+        </w:rPr>
+        <w:t>minutes</w:t>
+      </w:r>
+      <w:proofErr w:type="spellEnd"/>
+      <w:r>
+        <w:rPr>
+          <w:rFonts w:ascii="Arial" w:hAnsi="Arial" w:cs="Arial"/>
+          <w:color w:val="000000" w:themeColor="text1"/>
+          <w:sz w:val="22"/>
+          <w:szCs w:val="22"/>
+        </w:rPr>
+        <w:t xml:space="preserve"> ago               </w:t>
+      </w:r>
+      <w:proofErr w:type="spellStart"/>
+      <w:r>
+        <w:rPr>
+          <w:rFonts w:ascii="Arial" w:hAnsi="Arial" w:cs="Arial"/>
+          <w:color w:val="000000" w:themeColor="text1"/>
+          <w:sz w:val="22"/>
+          <w:szCs w:val="22"/>
+        </w:rPr>
+        <w:t>springboot-app</w:t>
+      </w:r>
+      <w:proofErr w:type="spellEnd"/>
+    </w:p>
+    <w:p>
+      <w:pPr>
+        <w:rPr>
+          <w:rFonts w:ascii="Arial" w:hAnsi="Arial" w:cs="Arial"/>
+          <w:color w:val="000000" w:themeColor="text1"/>
+          <w:sz w:val="22"/>
+          <w:szCs w:val="22"/>
+        </w:rPr>
+      </w:pPr>
+      <w:r>
+        <w:rPr>
+          <w:rFonts w:ascii="Arial" w:hAnsi="Arial" w:cs="Arial"/>
+          <w:color w:val="000000" w:themeColor="text1"/>
+          <w:sz w:val="22"/>
+          <w:szCs w:val="22"/>
+        </w:rPr>
+        <w:t xml:space="preserve">5b6a69429dd2   </w:t>
+      </w:r>
+      <w:proofErr w:type="spellStart"/>
+      <w:r>
+        <w:rPr>
+          <w:rFonts w:ascii="Arial" w:hAnsi="Arial" w:cs="Arial"/>
+          <w:color w:val="000000" w:themeColor="text1"/>
+          <w:sz w:val="22"/>
+          <w:szCs w:val="22"/>
+        </w:rPr>
+        <w:t>postgis</w:t>
+      </w:r>
+      <w:proofErr w:type="spellEnd"/>
+      <w:r>
+        <w:rPr>
+          <w:rFonts w:ascii="Arial" w:hAnsi="Arial" w:cs="Arial"/>
+          <w:color w:val="000000" w:themeColor="text1"/>
+          <w:sz w:val="22"/>
+          <w:szCs w:val="22"/>
+        </w:rPr>
+        <w:t>/postgis:16-3.4       "</w:t>
+      </w:r>
+      <w:proofErr w:type="spellStart"/>
+      <w:r>
+        <w:rPr>
+          <w:rFonts w:ascii="Arial" w:hAnsi="Arial" w:cs="Arial"/>
+          <w:color w:val="000000" w:themeColor="text1"/>
+          <w:sz w:val="22"/>
+          <w:szCs w:val="22"/>
+        </w:rPr>
+        <w:t>docker-entrypoint.s</w:t>
+      </w:r>
+      <w:proofErr w:type="spellEnd"/>
+      <w:r>
+        <w:rPr>
+          <w:rFonts w:ascii="Arial" w:hAnsi="Arial" w:cs="Arial"/>
+          <w:color w:val="000000" w:themeColor="text1"/>
+          <w:sz w:val="22"/>
+          <w:szCs w:val="22"/>
+        </w:rPr>
+        <w:t xml:space="preserve">…"   12 </w:t>
+      </w:r>
+      <w:proofErr w:type="spellStart"/>
+      <w:r>
+        <w:rPr>
+          <w:rFonts w:ascii="Arial" w:hAnsi="Arial" w:cs="Arial"/>
+          <w:color w:val="000000" w:themeColor="text1"/>
+          <w:sz w:val="22"/>
+          <w:szCs w:val="22"/>
+        </w:rPr>
+        <w:t>minutes</w:t>
+      </w:r>
+      <w:proofErr w:type="spellEnd"/>
+      <w:r>
+        <w:rPr>
+          <w:rFonts w:ascii="Arial" w:hAnsi="Arial" w:cs="Arial"/>
+          <w:color w:val="000000" w:themeColor="text1"/>
+          <w:sz w:val="22"/>
+          <w:szCs w:val="22"/>
+        </w:rPr>
+        <w:t xml:space="preserve"> ago   </w:t>
+      </w:r>
+      <w:proofErr w:type="spellStart"/>
+      <w:r>
+        <w:rPr>
+          <w:rFonts w:ascii="Arial" w:hAnsi="Arial" w:cs="Arial"/>
+          <w:color w:val="000000" w:themeColor="text1"/>
+          <w:sz w:val="22"/>
+          <w:szCs w:val="22"/>
+        </w:rPr>
+        <w:t>Exited</w:t>
+      </w:r>
+      <w:proofErr w:type="spellEnd"/>
+      <w:r>
+        <w:rPr>
+          <w:rFonts w:ascii="Arial" w:hAnsi="Arial" w:cs="Arial"/>
+          <w:color w:val="000000" w:themeColor="text1"/>
+          <w:sz w:val="22"/>
+          <w:szCs w:val="22"/>
+        </w:rPr>
+        <w:t xml:space="preserve"> (137) 6 </w:t>
+      </w:r>
+      <w:proofErr w:type="spellStart"/>
+      <w:r>
+        <w:rPr>
+          <w:rFonts w:ascii="Arial" w:hAnsi="Arial" w:cs="Arial"/>
+          <w:color w:val="000000" w:themeColor="text1"/>
+          <w:sz w:val="22"/>
+          <w:szCs w:val="22"/>
+        </w:rPr>
+        <w:t>minutes</w:t>
+      </w:r>
+      <w:proofErr w:type="spellEnd"/>
+      <w:r>
+        <w:rPr>
+          <w:rFonts w:ascii="Arial" w:hAnsi="Arial" w:cs="Arial"/>
+          <w:color w:val="000000" w:themeColor="text1"/>
+          <w:sz w:val="22"/>
+          <w:szCs w:val="22"/>
+        </w:rPr>
+        <w:t xml:space="preserve"> ago             </w:t>
+      </w:r>
+      <w:proofErr w:type="spellStart"/>
+      <w:r>
+        <w:rPr>
+          <w:rFonts w:ascii="Arial" w:hAnsi="Arial" w:cs="Arial"/>
+          <w:color w:val="000000" w:themeColor="text1"/>
+          <w:sz w:val="22"/>
+          <w:szCs w:val="22"/>
+        </w:rPr>
+        <w:t>postgres-db</w:t>
+      </w:r>
+      <w:proofErr w:type="spellEnd"/>
+      <w:r>
+        <w:rPr>
+          <w:rFonts w:ascii="Arial" w:hAnsi="Arial" w:cs="Arial"/>
+          <w:color w:val="000000" w:themeColor="text1"/>
+          <w:sz w:val="22"/>
+          <w:szCs w:val="22"/>
+        </w:rPr>
+        <w:br/>
+      </w:r>
+      <w:r>
+        <w:rPr>
+          <w:rFonts w:ascii="Arial" w:hAnsi="Arial" w:cs="Arial"/>
+          <w:color w:val="000000" w:themeColor="text1"/>
+          <w:sz w:val="22"/>
+          <w:szCs w:val="22"/>
+        </w:rPr>
+        <w:br/>
+      </w:r>
+      <w:proofErr w:type="spellStart"/>
+      <w:r>
+        <w:rPr>
+          <w:rFonts w:ascii="Arial" w:hAnsi="Arial" w:cs="Arial"/>
+          <w:color w:val="000000" w:themeColor="text1"/>
+          <w:sz w:val="22"/>
+          <w:szCs w:val="22"/>
+        </w:rPr>
+        <w:t>docker</w:t>
+      </w:r>
+      <w:proofErr w:type="spellEnd"/>
+      <w:r>
+        <w:rPr>
+          <w:rFonts w:ascii="Arial" w:hAnsi="Arial" w:cs="Arial"/>
+          <w:color w:val="000000" w:themeColor="text1"/>
+          <w:sz w:val="22"/>
+          <w:szCs w:val="22"/>
+        </w:rPr>
+        <w:t xml:space="preserve"> </w:t>
+      </w:r>
+      <w:proofErr w:type="spellStart"/>
+      <w:r>
+        <w:rPr>
+          <w:rFonts w:ascii="Arial" w:hAnsi="Arial" w:cs="Arial"/>
+          <w:color w:val="000000" w:themeColor="text1"/>
+          <w:sz w:val="22"/>
+          <w:szCs w:val="22"/>
+        </w:rPr>
+        <w:t>rm</w:t>
+      </w:r>
+      <w:proofErr w:type="spellEnd"/>
+      <w:r>
+        <w:rPr>
+          <w:rFonts w:ascii="Arial" w:hAnsi="Arial" w:cs="Arial"/>
+          <w:color w:val="000000" w:themeColor="text1"/>
+          <w:sz w:val="22"/>
+          <w:szCs w:val="22"/>
+        </w:rPr>
+        <w:t xml:space="preserve"> </w:t>
+      </w:r>
+      <w:proofErr w:type="spellStart"/>
+      <w:r>
+        <w:rPr>
+          <w:rFonts w:ascii="Arial" w:hAnsi="Arial" w:cs="Arial"/>
+          <w:color w:val="000000" w:themeColor="text1"/>
+          <w:sz w:val="22"/>
+          <w:szCs w:val="22"/>
+        </w:rPr>
+        <w:t>springboot-app</w:t>
+      </w:r>
+      <w:proofErr w:type="spellEnd"/>
+    </w:p>
+    <w:p>
+      <w:pPr>
+        <w:rPr>
+          <w:rFonts w:ascii="Arial" w:hAnsi="Arial" w:cs="Arial"/>
+          <w:b/>
+          <w:bCs/>
+          <w:color w:val="000000" w:themeColor="text1"/>
+          <w:sz w:val="22"/>
+          <w:szCs w:val="22"/>
+        </w:rPr>
+      </w:pPr>
+      <w:proofErr w:type="spellStart"/>
+      <w:r>
+        <w:rPr>
+          <w:rFonts w:ascii="Arial" w:hAnsi="Arial" w:cs="Arial"/>
+          <w:b/>
+          <w:bCs/>
+          <w:color w:val="000000" w:themeColor="text1"/>
+          <w:sz w:val="22"/>
+          <w:szCs w:val="22"/>
+        </w:rPr>
+        <w:t>docker</w:t>
+      </w:r>
+      <w:proofErr w:type="spellEnd"/>
+      <w:r>
+        <w:rPr>
+          <w:rFonts w:ascii="Arial" w:hAnsi="Arial" w:cs="Arial"/>
+          <w:b/>
+          <w:bCs/>
+          <w:color w:val="000000" w:themeColor="text1"/>
+          <w:sz w:val="22"/>
+          <w:szCs w:val="22"/>
+        </w:rPr>
+        <w:t xml:space="preserve"> </w:t>
+      </w:r>
+      <w:proofErr w:type="spellStart"/>
+      <w:r>
+        <w:rPr>
+          <w:rFonts w:ascii="Arial" w:hAnsi="Arial" w:cs="Arial"/>
+          <w:b/>
+          <w:bCs/>
+          <w:color w:val="000000" w:themeColor="text1"/>
+          <w:sz w:val="22"/>
+          <w:szCs w:val="22"/>
+        </w:rPr>
+        <w:t>rmi</w:t>
+      </w:r>
+      <w:proofErr w:type="spellEnd"/>
+      <w:r>
+        <w:rPr>
+          <w:rFonts w:ascii="Arial" w:hAnsi="Arial" w:cs="Arial"/>
+          <w:b/>
+          <w:bCs/>
+          <w:color w:val="000000" w:themeColor="text1"/>
+          <w:sz w:val="22"/>
+          <w:szCs w:val="22"/>
+        </w:rPr>
+        <w:t xml:space="preserve"> </w:t>
+      </w:r>
+      <w:proofErr w:type="spellStart"/>
+      <w:r>
+        <w:rPr>
+          <w:rFonts w:ascii="Arial" w:hAnsi="Arial" w:cs="Arial"/>
+          <w:b/>
+          <w:bCs/>
+          <w:color w:val="000000" w:themeColor="text1"/>
+          <w:sz w:val="22"/>
+          <w:szCs w:val="22"/>
+        </w:rPr>
+        <w:t>warfare-simulation-api:latest</w:t>
+      </w:r>
+      <w:proofErr w:type="spellEnd"/>
+    </w:p>
+    <w:p>
+      <w:pPr>
+        <w:rPr>
+          <w:rFonts w:ascii="Arial" w:hAnsi="Arial" w:cs="Arial"/>
+          <w:color w:val="000000" w:themeColor="text1"/>
+          <w:sz w:val="22"/>
+          <w:szCs w:val="22"/>
+        </w:rPr>
+      </w:pPr>
+    </w:p>
+    <w:p>
+      <w:pPr>
+        <w:rPr>
+          <w:rFonts w:ascii="Arial" w:hAnsi="Arial" w:cs="Arial"/>
+          <w:color w:val="000000" w:themeColor="text1"/>
+          <w:sz w:val="22"/>
+          <w:szCs w:val="22"/>
+        </w:rPr>
+      </w:pPr>
+      <w:r>
+        <w:rPr>
+          <w:rFonts w:ascii="Arial" w:hAnsi="Arial" w:cs="Arial"/>
+          <w:color w:val="000000" w:themeColor="text1"/>
+          <w:sz w:val="22"/>
+          <w:szCs w:val="22"/>
+        </w:rPr>
         <w:t xml:space="preserve">2. </w:t>
       </w:r>
       <w:r>
@@ -2002,6 +2519,15 @@
           <w:sz w:val="22"/>
           <w:szCs w:val="22"/>
         </w:rPr>
+        <w:t xml:space="preserve"> </w:t>
+      </w:r>
+      <w:r>
+        <w:rPr>
+          <w:rFonts w:ascii="Arial" w:hAnsi="Arial" w:cs="Arial"/>
+          <w:color w:val="000000" w:themeColor="text1"/>
+          <w:sz w:val="22"/>
+          <w:szCs w:val="22"/>
+        </w:rPr>
         <w:br/>
       </w:r>
       <w:proofErr w:type="spellStart"/>
@@ -2042,7 +2568,7 @@
           <w:sz w:val="22"/>
           <w:szCs w:val="22"/>
         </w:rPr>
-        <w:t xml:space="preserve"> -t </w:t>
+        <w:t xml:space="preserve"> --no-cache -t </w:t>
       </w:r>
       <w:proofErr w:type="spellStart"/>
       <w:r>
@@ -2064,500 +2590,6 @@
         </w:rPr>
         <w:t xml:space="preserve"> .</w:t>
       </w:r>
-    </w:p>
-    <w:p>
-      <w:pPr>
-        <w:rPr>
-          <w:rFonts w:ascii="Arial" w:hAnsi="Arial" w:cs="Arial"/>
-          <w:color w:val="000000" w:themeColor="text1"/>
-          <w:sz w:val="22"/>
-          <w:szCs w:val="22"/>
-        </w:rPr>
-      </w:pPr>
-    </w:p>
-    <w:p>
-      <w:pPr>
-        <w:rPr>
-          <w:rFonts w:ascii="Arial" w:hAnsi="Arial" w:cs="Arial"/>
-          <w:color w:val="000000" w:themeColor="text1"/>
-          <w:sz w:val="22"/>
-          <w:szCs w:val="22"/>
-        </w:rPr>
-      </w:pPr>
-      <w:r>
-        <w:rPr>
-          <w:rFonts w:ascii="Arial" w:hAnsi="Arial" w:cs="Arial"/>
-          <w:color w:val="000000" w:themeColor="text1"/>
-          <w:sz w:val="22"/>
-          <w:szCs w:val="22"/>
-        </w:rPr>
-        <w:t>W przypadku przebudowania po raz kolejny, usunąć stary:</w:t>
-      </w:r>
-      <w:r>
-        <w:rPr>
-          <w:rFonts w:ascii="Arial" w:hAnsi="Arial" w:cs="Arial"/>
-          <w:color w:val="000000" w:themeColor="text1"/>
-          <w:sz w:val="22"/>
-          <w:szCs w:val="22"/>
-        </w:rPr>
-        <w:br/>
-      </w:r>
-      <w:proofErr w:type="spellStart"/>
-      <w:r>
-        <w:rPr>
-          <w:rFonts w:ascii="Arial" w:hAnsi="Arial" w:cs="Arial"/>
-          <w:color w:val="000000" w:themeColor="text1"/>
-          <w:sz w:val="22"/>
-          <w:szCs w:val="22"/>
-        </w:rPr>
-        <w:t>docker</w:t>
-      </w:r>
-      <w:proofErr w:type="spellEnd"/>
-      <w:r>
-        <w:rPr>
-          <w:rFonts w:ascii="Arial" w:hAnsi="Arial" w:cs="Arial"/>
-          <w:color w:val="000000" w:themeColor="text1"/>
-          <w:sz w:val="22"/>
-          <w:szCs w:val="22"/>
-        </w:rPr>
-        <w:t xml:space="preserve"> </w:t>
-      </w:r>
-      <w:proofErr w:type="spellStart"/>
-      <w:r>
-        <w:rPr>
-          <w:rFonts w:ascii="Arial" w:hAnsi="Arial" w:cs="Arial"/>
-          <w:color w:val="000000" w:themeColor="text1"/>
-          <w:sz w:val="22"/>
-          <w:szCs w:val="22"/>
-        </w:rPr>
-        <w:t>ps</w:t>
-      </w:r>
-      <w:proofErr w:type="spellEnd"/>
-      <w:r>
-        <w:rPr>
-          <w:rFonts w:ascii="Arial" w:hAnsi="Arial" w:cs="Arial"/>
-          <w:color w:val="000000" w:themeColor="text1"/>
-          <w:sz w:val="22"/>
-          <w:szCs w:val="22"/>
-        </w:rPr>
-        <w:t xml:space="preserve"> -a</w:t>
-      </w:r>
-      <w:r>
-        <w:rPr>
-          <w:rFonts w:ascii="Arial" w:hAnsi="Arial" w:cs="Arial"/>
-          <w:color w:val="000000" w:themeColor="text1"/>
-          <w:sz w:val="22"/>
-          <w:szCs w:val="22"/>
-        </w:rPr>
-        <w:br/>
-      </w:r>
-      <w:r>
-        <w:rPr>
-          <w:rFonts w:ascii="Arial" w:hAnsi="Arial" w:cs="Arial"/>
-          <w:color w:val="000000" w:themeColor="text1"/>
-          <w:sz w:val="22"/>
-          <w:szCs w:val="22"/>
-        </w:rPr>
-        <w:br/>
-      </w:r>
-      <w:r>
-        <w:rPr>
-          <w:rFonts w:ascii="Arial" w:hAnsi="Arial" w:cs="Arial"/>
-          <w:color w:val="000000" w:themeColor="text1"/>
-          <w:sz w:val="22"/>
-          <w:szCs w:val="22"/>
-        </w:rPr>
-        <w:t xml:space="preserve">PS C:\Users\krzysztof.lipka\repo\warfare-simulation-api&gt; </w:t>
-      </w:r>
-      <w:proofErr w:type="spellStart"/>
-      <w:r>
-        <w:rPr>
-          <w:rFonts w:ascii="Arial" w:hAnsi="Arial" w:cs="Arial"/>
-          <w:color w:val="000000" w:themeColor="text1"/>
-          <w:sz w:val="22"/>
-          <w:szCs w:val="22"/>
-        </w:rPr>
-        <w:t>docker</w:t>
-      </w:r>
-      <w:proofErr w:type="spellEnd"/>
-      <w:r>
-        <w:rPr>
-          <w:rFonts w:ascii="Arial" w:hAnsi="Arial" w:cs="Arial"/>
-          <w:color w:val="000000" w:themeColor="text1"/>
-          <w:sz w:val="22"/>
-          <w:szCs w:val="22"/>
-        </w:rPr>
-        <w:t xml:space="preserve"> </w:t>
-      </w:r>
-      <w:proofErr w:type="spellStart"/>
-      <w:r>
-        <w:rPr>
-          <w:rFonts w:ascii="Arial" w:hAnsi="Arial" w:cs="Arial"/>
-          <w:color w:val="000000" w:themeColor="text1"/>
-          <w:sz w:val="22"/>
-          <w:szCs w:val="22"/>
-        </w:rPr>
-        <w:t>ps</w:t>
-      </w:r>
-      <w:proofErr w:type="spellEnd"/>
-      <w:r>
-        <w:rPr>
-          <w:rFonts w:ascii="Arial" w:hAnsi="Arial" w:cs="Arial"/>
-          <w:color w:val="000000" w:themeColor="text1"/>
-          <w:sz w:val="22"/>
-          <w:szCs w:val="22"/>
-        </w:rPr>
-        <w:t xml:space="preserve"> -a</w:t>
-      </w:r>
-    </w:p>
-    <w:p>
-      <w:pPr>
-        <w:rPr>
-          <w:rFonts w:ascii="Arial" w:hAnsi="Arial" w:cs="Arial"/>
-          <w:color w:val="000000" w:themeColor="text1"/>
-          <w:sz w:val="22"/>
-          <w:szCs w:val="22"/>
-        </w:rPr>
-      </w:pPr>
-      <w:r>
-        <w:rPr>
-          <w:rFonts w:ascii="Arial" w:hAnsi="Arial" w:cs="Arial"/>
-          <w:color w:val="000000" w:themeColor="text1"/>
-          <w:sz w:val="22"/>
-          <w:szCs w:val="22"/>
-        </w:rPr>
-        <w:lastRenderedPageBreak/>
-        <w:t>CONTAINER ID   IMAGE                        COMMAND                  CREATED          STATUS                       PORTS     NAMES</w:t>
-      </w:r>
-    </w:p>
-    <w:p>
-      <w:pPr>
-        <w:rPr>
-          <w:rFonts w:ascii="Arial" w:hAnsi="Arial" w:cs="Arial"/>
-          <w:color w:val="000000" w:themeColor="text1"/>
-          <w:sz w:val="22"/>
-          <w:szCs w:val="22"/>
-        </w:rPr>
-      </w:pPr>
-      <w:r>
-        <w:rPr>
-          <w:rFonts w:ascii="Arial" w:hAnsi="Arial" w:cs="Arial"/>
-          <w:color w:val="000000" w:themeColor="text1"/>
-          <w:sz w:val="22"/>
-          <w:szCs w:val="22"/>
-        </w:rPr>
-        <w:t xml:space="preserve">2a4bcdd67ab4   </w:t>
-      </w:r>
-      <w:proofErr w:type="spellStart"/>
-      <w:r>
-        <w:rPr>
-          <w:rFonts w:ascii="Arial" w:hAnsi="Arial" w:cs="Arial"/>
-          <w:color w:val="000000" w:themeColor="text1"/>
-          <w:sz w:val="22"/>
-          <w:szCs w:val="22"/>
-        </w:rPr>
-        <w:t>warfare-simulation-api-app</w:t>
-      </w:r>
-      <w:proofErr w:type="spellEnd"/>
-      <w:r>
-        <w:rPr>
-          <w:rFonts w:ascii="Arial" w:hAnsi="Arial" w:cs="Arial"/>
-          <w:color w:val="000000" w:themeColor="text1"/>
-          <w:sz w:val="22"/>
-          <w:szCs w:val="22"/>
-        </w:rPr>
-        <w:t xml:space="preserve">   "</w:t>
-      </w:r>
-      <w:proofErr w:type="spellStart"/>
-      <w:r>
-        <w:rPr>
-          <w:rFonts w:ascii="Arial" w:hAnsi="Arial" w:cs="Arial"/>
-          <w:color w:val="000000" w:themeColor="text1"/>
-          <w:sz w:val="22"/>
-          <w:szCs w:val="22"/>
-        </w:rPr>
-        <w:t>java</w:t>
-      </w:r>
-      <w:proofErr w:type="spellEnd"/>
-      <w:r>
-        <w:rPr>
-          <w:rFonts w:ascii="Arial" w:hAnsi="Arial" w:cs="Arial"/>
-          <w:color w:val="000000" w:themeColor="text1"/>
-          <w:sz w:val="22"/>
-          <w:szCs w:val="22"/>
-        </w:rPr>
-        <w:t xml:space="preserve"> -jar app.jar"      12 </w:t>
-      </w:r>
-      <w:proofErr w:type="spellStart"/>
-      <w:r>
-        <w:rPr>
-          <w:rFonts w:ascii="Arial" w:hAnsi="Arial" w:cs="Arial"/>
-          <w:color w:val="000000" w:themeColor="text1"/>
-          <w:sz w:val="22"/>
-          <w:szCs w:val="22"/>
-        </w:rPr>
-        <w:t>minutes</w:t>
-      </w:r>
-      <w:proofErr w:type="spellEnd"/>
-      <w:r>
-        <w:rPr>
-          <w:rFonts w:ascii="Arial" w:hAnsi="Arial" w:cs="Arial"/>
-          <w:color w:val="000000" w:themeColor="text1"/>
-          <w:sz w:val="22"/>
-          <w:szCs w:val="22"/>
-        </w:rPr>
-        <w:t xml:space="preserve"> ago   </w:t>
-      </w:r>
-      <w:proofErr w:type="spellStart"/>
-      <w:r>
-        <w:rPr>
-          <w:rFonts w:ascii="Arial" w:hAnsi="Arial" w:cs="Arial"/>
-          <w:color w:val="000000" w:themeColor="text1"/>
-          <w:sz w:val="22"/>
-          <w:szCs w:val="22"/>
-        </w:rPr>
-        <w:t>Exited</w:t>
-      </w:r>
-      <w:proofErr w:type="spellEnd"/>
-      <w:r>
-        <w:rPr>
-          <w:rFonts w:ascii="Arial" w:hAnsi="Arial" w:cs="Arial"/>
-          <w:color w:val="000000" w:themeColor="text1"/>
-          <w:sz w:val="22"/>
-          <w:szCs w:val="22"/>
-        </w:rPr>
-        <w:t xml:space="preserve"> (1) 7 </w:t>
-      </w:r>
-      <w:proofErr w:type="spellStart"/>
-      <w:r>
-        <w:rPr>
-          <w:rFonts w:ascii="Arial" w:hAnsi="Arial" w:cs="Arial"/>
-          <w:color w:val="000000" w:themeColor="text1"/>
-          <w:sz w:val="22"/>
-          <w:szCs w:val="22"/>
-        </w:rPr>
-        <w:t>minutes</w:t>
-      </w:r>
-      <w:proofErr w:type="spellEnd"/>
-      <w:r>
-        <w:rPr>
-          <w:rFonts w:ascii="Arial" w:hAnsi="Arial" w:cs="Arial"/>
-          <w:color w:val="000000" w:themeColor="text1"/>
-          <w:sz w:val="22"/>
-          <w:szCs w:val="22"/>
-        </w:rPr>
-        <w:t xml:space="preserve"> ago               </w:t>
-      </w:r>
-      <w:proofErr w:type="spellStart"/>
-      <w:r>
-        <w:rPr>
-          <w:rFonts w:ascii="Arial" w:hAnsi="Arial" w:cs="Arial"/>
-          <w:color w:val="000000" w:themeColor="text1"/>
-          <w:sz w:val="22"/>
-          <w:szCs w:val="22"/>
-        </w:rPr>
-        <w:t>springboot-app</w:t>
-      </w:r>
-      <w:proofErr w:type="spellEnd"/>
-    </w:p>
-    <w:p>
-      <w:pPr>
-        <w:rPr>
-          <w:rFonts w:ascii="Arial" w:hAnsi="Arial" w:cs="Arial"/>
-          <w:color w:val="000000" w:themeColor="text1"/>
-          <w:sz w:val="22"/>
-          <w:szCs w:val="22"/>
-        </w:rPr>
-      </w:pPr>
-      <w:r>
-        <w:rPr>
-          <w:rFonts w:ascii="Arial" w:hAnsi="Arial" w:cs="Arial"/>
-          <w:color w:val="000000" w:themeColor="text1"/>
-          <w:sz w:val="22"/>
-          <w:szCs w:val="22"/>
-        </w:rPr>
-        <w:t xml:space="preserve">5b6a69429dd2   </w:t>
-      </w:r>
-      <w:proofErr w:type="spellStart"/>
-      <w:r>
-        <w:rPr>
-          <w:rFonts w:ascii="Arial" w:hAnsi="Arial" w:cs="Arial"/>
-          <w:color w:val="000000" w:themeColor="text1"/>
-          <w:sz w:val="22"/>
-          <w:szCs w:val="22"/>
-        </w:rPr>
-        <w:t>postgis</w:t>
-      </w:r>
-      <w:proofErr w:type="spellEnd"/>
-      <w:r>
-        <w:rPr>
-          <w:rFonts w:ascii="Arial" w:hAnsi="Arial" w:cs="Arial"/>
-          <w:color w:val="000000" w:themeColor="text1"/>
-          <w:sz w:val="22"/>
-          <w:szCs w:val="22"/>
-        </w:rPr>
-        <w:t>/postgis:16-3.4       "</w:t>
-      </w:r>
-      <w:proofErr w:type="spellStart"/>
-      <w:r>
-        <w:rPr>
-          <w:rFonts w:ascii="Arial" w:hAnsi="Arial" w:cs="Arial"/>
-          <w:color w:val="000000" w:themeColor="text1"/>
-          <w:sz w:val="22"/>
-          <w:szCs w:val="22"/>
-        </w:rPr>
-        <w:t>docker-entrypoint.s</w:t>
-      </w:r>
-      <w:proofErr w:type="spellEnd"/>
-      <w:r>
-        <w:rPr>
-          <w:rFonts w:ascii="Arial" w:hAnsi="Arial" w:cs="Arial"/>
-          <w:color w:val="000000" w:themeColor="text1"/>
-          <w:sz w:val="22"/>
-          <w:szCs w:val="22"/>
-        </w:rPr>
-        <w:t xml:space="preserve">…"   12 </w:t>
-      </w:r>
-      <w:proofErr w:type="spellStart"/>
-      <w:r>
-        <w:rPr>
-          <w:rFonts w:ascii="Arial" w:hAnsi="Arial" w:cs="Arial"/>
-          <w:color w:val="000000" w:themeColor="text1"/>
-          <w:sz w:val="22"/>
-          <w:szCs w:val="22"/>
-        </w:rPr>
-        <w:t>minutes</w:t>
-      </w:r>
-      <w:proofErr w:type="spellEnd"/>
-      <w:r>
-        <w:rPr>
-          <w:rFonts w:ascii="Arial" w:hAnsi="Arial" w:cs="Arial"/>
-          <w:color w:val="000000" w:themeColor="text1"/>
-          <w:sz w:val="22"/>
-          <w:szCs w:val="22"/>
-        </w:rPr>
-        <w:t xml:space="preserve"> ago   </w:t>
-      </w:r>
-      <w:proofErr w:type="spellStart"/>
-      <w:r>
-        <w:rPr>
-          <w:rFonts w:ascii="Arial" w:hAnsi="Arial" w:cs="Arial"/>
-          <w:color w:val="000000" w:themeColor="text1"/>
-          <w:sz w:val="22"/>
-          <w:szCs w:val="22"/>
-        </w:rPr>
-        <w:t>Exited</w:t>
-      </w:r>
-      <w:proofErr w:type="spellEnd"/>
-      <w:r>
-        <w:rPr>
-          <w:rFonts w:ascii="Arial" w:hAnsi="Arial" w:cs="Arial"/>
-          <w:color w:val="000000" w:themeColor="text1"/>
-          <w:sz w:val="22"/>
-          <w:szCs w:val="22"/>
-        </w:rPr>
-        <w:t xml:space="preserve"> (137) 6 </w:t>
-      </w:r>
-      <w:proofErr w:type="spellStart"/>
-      <w:r>
-        <w:rPr>
-          <w:rFonts w:ascii="Arial" w:hAnsi="Arial" w:cs="Arial"/>
-          <w:color w:val="000000" w:themeColor="text1"/>
-          <w:sz w:val="22"/>
-          <w:szCs w:val="22"/>
-        </w:rPr>
-        <w:t>minutes</w:t>
-      </w:r>
-      <w:proofErr w:type="spellEnd"/>
-      <w:r>
-        <w:rPr>
-          <w:rFonts w:ascii="Arial" w:hAnsi="Arial" w:cs="Arial"/>
-          <w:color w:val="000000" w:themeColor="text1"/>
-          <w:sz w:val="22"/>
-          <w:szCs w:val="22"/>
-        </w:rPr>
-        <w:t xml:space="preserve"> ago             </w:t>
-      </w:r>
-      <w:proofErr w:type="spellStart"/>
-      <w:r>
-        <w:rPr>
-          <w:rFonts w:ascii="Arial" w:hAnsi="Arial" w:cs="Arial"/>
-          <w:color w:val="000000" w:themeColor="text1"/>
-          <w:sz w:val="22"/>
-          <w:szCs w:val="22"/>
-        </w:rPr>
-        <w:t>postgres-db</w:t>
-      </w:r>
-      <w:proofErr w:type="spellEnd"/>
-      <w:r>
-        <w:rPr>
-          <w:rFonts w:ascii="Arial" w:hAnsi="Arial" w:cs="Arial"/>
-          <w:color w:val="000000" w:themeColor="text1"/>
-          <w:sz w:val="22"/>
-          <w:szCs w:val="22"/>
-        </w:rPr>
-        <w:br/>
-      </w:r>
-      <w:r>
-        <w:rPr>
-          <w:rFonts w:ascii="Arial" w:hAnsi="Arial" w:cs="Arial"/>
-          <w:color w:val="000000" w:themeColor="text1"/>
-          <w:sz w:val="22"/>
-          <w:szCs w:val="22"/>
-        </w:rPr>
-        <w:br/>
-      </w:r>
-      <w:proofErr w:type="spellStart"/>
-      <w:r>
-        <w:rPr>
-          <w:rFonts w:ascii="Arial" w:hAnsi="Arial" w:cs="Arial"/>
-          <w:color w:val="000000" w:themeColor="text1"/>
-          <w:sz w:val="22"/>
-          <w:szCs w:val="22"/>
-        </w:rPr>
-        <w:t>docker</w:t>
-      </w:r>
-      <w:proofErr w:type="spellEnd"/>
-      <w:r>
-        <w:rPr>
-          <w:rFonts w:ascii="Arial" w:hAnsi="Arial" w:cs="Arial"/>
-          <w:color w:val="000000" w:themeColor="text1"/>
-          <w:sz w:val="22"/>
-          <w:szCs w:val="22"/>
-        </w:rPr>
-        <w:t xml:space="preserve"> </w:t>
-      </w:r>
-      <w:proofErr w:type="spellStart"/>
-      <w:r>
-        <w:rPr>
-          <w:rFonts w:ascii="Arial" w:hAnsi="Arial" w:cs="Arial"/>
-          <w:color w:val="000000" w:themeColor="text1"/>
-          <w:sz w:val="22"/>
-          <w:szCs w:val="22"/>
-        </w:rPr>
-        <w:t>rm</w:t>
-      </w:r>
-      <w:proofErr w:type="spellEnd"/>
-      <w:r>
-        <w:rPr>
-          <w:rFonts w:ascii="Arial" w:hAnsi="Arial" w:cs="Arial"/>
-          <w:color w:val="000000" w:themeColor="text1"/>
-          <w:sz w:val="22"/>
-          <w:szCs w:val="22"/>
-        </w:rPr>
-        <w:t xml:space="preserve"> </w:t>
-      </w:r>
-      <w:proofErr w:type="spellStart"/>
-      <w:r>
-        <w:rPr>
-          <w:rFonts w:ascii="Arial" w:hAnsi="Arial" w:cs="Arial"/>
-          <w:color w:val="000000" w:themeColor="text1"/>
-          <w:sz w:val="22"/>
-          <w:szCs w:val="22"/>
-        </w:rPr>
-        <w:t>springboot-app</w:t>
-      </w:r>
-      <w:proofErr w:type="spellEnd"/>
     </w:p>
     <w:p>
       <w:pPr>
@@ -2788,24 +2820,148 @@
         <w:t>up</w:t>
       </w:r>
       <w:proofErr w:type="spellEnd"/>
-    </w:p>
-    <w:p>
-      <w:pPr>
-        <w:rPr>
-          <w:rFonts w:ascii="Arial" w:hAnsi="Arial" w:cs="Arial"/>
-          <w:color w:val="000000" w:themeColor="text1"/>
-          <w:sz w:val="22"/>
-          <w:szCs w:val="22"/>
-        </w:rPr>
-      </w:pPr>
-      <w:r>
-        <w:rPr>
-          <w:rFonts w:ascii="Arial" w:hAnsi="Arial" w:cs="Arial"/>
-          <w:color w:val="000000" w:themeColor="text1"/>
-          <w:sz w:val="22"/>
-          <w:szCs w:val="22"/>
-        </w:rPr>
-        <w:t>UWAGA: W celu testowania lokalnie bez uruchamiania kontenera z aplikacją, należy</w:t>
+      <w:r>
+        <w:rPr>
+          <w:rFonts w:ascii="Arial" w:hAnsi="Arial" w:cs="Arial"/>
+          <w:color w:val="000000" w:themeColor="text1"/>
+          <w:sz w:val="22"/>
+          <w:szCs w:val="22"/>
+        </w:rPr>
+        <w:t xml:space="preserve"> </w:t>
+      </w:r>
+      <w:r>
+        <w:rPr>
+          <w:rFonts w:ascii="Arial" w:hAnsi="Arial" w:cs="Arial"/>
+          <w:color w:val="EE0000"/>
+          <w:sz w:val="22"/>
+          <w:szCs w:val="22"/>
+        </w:rPr>
+        <w:t>--</w:t>
+      </w:r>
+      <w:proofErr w:type="spellStart"/>
+      <w:r>
+        <w:rPr>
+          <w:rFonts w:ascii="Arial" w:hAnsi="Arial" w:cs="Arial"/>
+          <w:color w:val="EE0000"/>
+          <w:sz w:val="22"/>
+          <w:szCs w:val="22"/>
+        </w:rPr>
+        <w:t>force-recreate</w:t>
+      </w:r>
+      <w:proofErr w:type="spellEnd"/>
+      <w:r>
+        <w:rPr>
+          <w:rFonts w:ascii="Arial" w:hAnsi="Arial" w:cs="Arial"/>
+          <w:color w:val="EE0000"/>
+          <w:sz w:val="22"/>
+          <w:szCs w:val="22"/>
+        </w:rPr>
+        <w:t xml:space="preserve"> </w:t>
+      </w:r>
+      <w:r>
+        <w:rPr>
+          <w:rFonts w:ascii="Arial" w:hAnsi="Arial" w:cs="Arial"/>
+          <w:color w:val="EE0000"/>
+          <w:sz w:val="22"/>
+          <w:szCs w:val="22"/>
+        </w:rPr>
+        <w:t>–</w:t>
+      </w:r>
+      <w:proofErr w:type="spellStart"/>
+      <w:r>
+        <w:rPr>
+          <w:rFonts w:ascii="Arial" w:hAnsi="Arial" w:cs="Arial"/>
+          <w:color w:val="EE0000"/>
+          <w:sz w:val="22"/>
+          <w:szCs w:val="22"/>
+        </w:rPr>
+        <w:t>build</w:t>
+      </w:r>
+      <w:proofErr w:type="spellEnd"/>
+      <w:r>
+        <w:rPr>
+          <w:rFonts w:ascii="Arial" w:hAnsi="Arial" w:cs="Arial"/>
+          <w:color w:val="EE0000"/>
+          <w:sz w:val="22"/>
+          <w:szCs w:val="22"/>
+        </w:rPr>
+        <w:br/>
+      </w:r>
+      <w:r>
+        <w:rPr>
+          <w:rFonts w:ascii="Arial" w:hAnsi="Arial" w:cs="Arial"/>
+          <w:color w:val="EE0000"/>
+          <w:sz w:val="22"/>
+          <w:szCs w:val="22"/>
+        </w:rPr>
+        <w:t>Ta opcja wymusza:</w:t>
+      </w:r>
+      <w:r>
+        <w:rPr>
+          <w:rFonts w:ascii="Arial" w:hAnsi="Arial" w:cs="Arial"/>
+          <w:color w:val="EE0000"/>
+          <w:sz w:val="22"/>
+          <w:szCs w:val="22"/>
+        </w:rPr>
+        <w:t xml:space="preserve"> </w:t>
+      </w:r>
+      <w:r>
+        <w:rPr>
+          <w:rFonts w:ascii="Arial" w:hAnsi="Arial" w:cs="Arial"/>
+          <w:color w:val="EE0000"/>
+          <w:sz w:val="22"/>
+          <w:szCs w:val="22"/>
+        </w:rPr>
+        <w:t xml:space="preserve">przebudowanie obrazów (jeśli zmieniłeś </w:t>
+      </w:r>
+      <w:proofErr w:type="spellStart"/>
+      <w:r>
+        <w:rPr>
+          <w:rFonts w:ascii="Arial" w:hAnsi="Arial" w:cs="Arial"/>
+          <w:color w:val="EE0000"/>
+          <w:sz w:val="22"/>
+          <w:szCs w:val="22"/>
+        </w:rPr>
+        <w:t>Dockerfile</w:t>
+      </w:r>
+      <w:proofErr w:type="spellEnd"/>
+      <w:r>
+        <w:rPr>
+          <w:rFonts w:ascii="Arial" w:hAnsi="Arial" w:cs="Arial"/>
+          <w:color w:val="EE0000"/>
+          <w:sz w:val="22"/>
+          <w:szCs w:val="22"/>
+        </w:rPr>
+        <w:t>),ponowne utworzenie kontenerów.</w:t>
+      </w:r>
+    </w:p>
+    <w:p>
+      <w:pPr>
+        <w:rPr>
+          <w:rFonts w:ascii="Arial" w:hAnsi="Arial" w:cs="Arial"/>
+          <w:color w:val="000000" w:themeColor="text1"/>
+          <w:sz w:val="22"/>
+          <w:szCs w:val="22"/>
+        </w:rPr>
+      </w:pPr>
+    </w:p>
+    <w:p>
+      <w:pPr>
+        <w:rPr>
+          <w:rFonts w:ascii="Arial" w:hAnsi="Arial" w:cs="Arial"/>
+          <w:color w:val="000000" w:themeColor="text1"/>
+          <w:sz w:val="22"/>
+          <w:szCs w:val="22"/>
+        </w:rPr>
+      </w:pPr>
+      <w:r>
+        <w:rPr>
+          <w:rFonts w:ascii="Arial" w:hAnsi="Arial" w:cs="Arial"/>
+          <w:color w:val="000000" w:themeColor="text1"/>
+          <w:sz w:val="22"/>
+          <w:szCs w:val="22"/>
+        </w:rPr>
+        <w:t>W celu testowania lokalnie bez uruchamiania kontenera z aplikacją, należy</w:t>
       </w:r>
       <w:r>
         <w:rPr>
@@ -3494,6 +3650,7 @@
           <w:sz w:val="22"/>
           <w:szCs w:val="22"/>
         </w:rPr>
+        <w:lastRenderedPageBreak/>
         <w:t xml:space="preserve">Krok </w:t>
       </w:r>
       <w:r>
@@ -3558,7 +3715,6 @@
           <w:sz w:val="22"/>
           <w:szCs w:val="22"/>
         </w:rPr>
-        <w:lastRenderedPageBreak/>
         <w:t>Kolejne kroki (gdy MVP działa)</w:t>
       </w:r>
     </w:p>

</xml_diff>